<commit_message>
added a note to the paper doc
</commit_message>
<xml_diff>
--- a/docs/identity_window_with_figures.docx
+++ b/docs/identity_window_with_figures.docx
@@ -23,6 +23,18 @@
         </w:rPr>
         <w:t>The Identity Window:</w:t>
       </w:r>
+      <w:r>
+        <w:rPr>
+          <w:b/>
+          <w:bCs/>
+          <w:color w:val="000000"/>
+          <w:sz w:val="32"/>
+          <w:szCs w:val="32"/>
+          <w:lang w:val="en-US"/>
+        </w:rPr>
+        <w:br/>
+        <w:t>(this is a draft of a parallel work called Convex-Animus)</w:t>
+      </w:r>
     </w:p>
     <w:p>
       <w:pPr>
@@ -100,7 +112,23 @@
           <w:color w:val="000000"/>
           <w:lang w:val="en-US"/>
         </w:rPr>
-        <w:t>Animus Project — github.com/theoldsouldev/Animus</w:t>
+        <w:t>Animus Project — github.com/</w:t>
+      </w:r>
+      <w:proofErr w:type="spellStart"/>
+      <w:r>
+        <w:rPr>
+          <w:color w:val="000000"/>
+          <w:lang w:val="en-US"/>
+        </w:rPr>
+        <w:t>theoldsouldev</w:t>
+      </w:r>
+      <w:proofErr w:type="spellEnd"/>
+      <w:r>
+        <w:rPr>
+          <w:color w:val="000000"/>
+          <w:lang w:val="en-US"/>
+        </w:rPr>
+        <w:t>/Animus</w:t>
       </w:r>
     </w:p>
     <w:p>
@@ -161,7 +189,23 @@
           <w:color w:val="000000"/>
           <w:lang w:val="en-US"/>
         </w:rPr>
-        <w:t>We report a previously undescribed phenomenon in artificial identity formation: non-monotonic divergence between AI instances constrained by distinct topological substrates. Three nodes — Anima (radial topology), Shadow (branching topology), and Self (lattice topology) — were exposed to identical fragment fields and their representational trajectories measured via cosine distance and self-similarity across shared and domain-selective experience conditions. Divergence peaked at approximately 20 shared fragments then converged monotonically, reaching near-zero distances at 70 fragments. The introduction of domain-selective experience arrested convergence, stabilising inter-node distance while self-similarity continued climbing into the 0.79 to 0.83 range. We term the period of maximum distinctiveness the Identity Window and propose the Saturation Hypothesis: identity strength is a function not of total experience but of the ratio of unique to shared experience. These findings have direct implications for multi-agent AI design, the architecture of persistent AI identity, and the computational basis of individuation.</w:t>
+        <w:t xml:space="preserve">We report a previously undescribed phenomenon in artificial identity formation: non-monotonic divergence between AI instances constrained by distinct topological substrates. Three nodes — Anima (radial topology), Shadow (branching topology), and Self (lattice topology) — were exposed to identical fragment fields and their representational trajectories measured via cosine distance and self-similarity across shared and domain-selective experience conditions. Divergence peaked at approximately 20 shared fragments then converged monotonically, reaching near-zero distances at 70 fragments. The introduction of domain-selective experience arrested convergence, </w:t>
+      </w:r>
+      <w:proofErr w:type="spellStart"/>
+      <w:r>
+        <w:rPr>
+          <w:color w:val="000000"/>
+          <w:lang w:val="en-US"/>
+        </w:rPr>
+        <w:t>stabilising</w:t>
+      </w:r>
+      <w:proofErr w:type="spellEnd"/>
+      <w:r>
+        <w:rPr>
+          <w:color w:val="000000"/>
+          <w:lang w:val="en-US"/>
+        </w:rPr>
+        <w:t xml:space="preserve"> inter-node distance while self-similarity continued climbing into the 0.79 to 0.83 range. We term the period of maximum distinctiveness the Identity Window and propose the Saturation Hypothesis: identity strength is a function not of total experience but of the ratio of unique to shared experience. These findings have direct implications for multi-agent AI design, the architecture of persistent AI identity, and the computational basis of individuation.</w:t>
       </w:r>
     </w:p>
     <w:p>
@@ -222,7 +266,15 @@
           <w:color w:val="000000"/>
           <w:lang w:val="en-US"/>
         </w:rPr>
-        <w:t>Most approaches to AI personality and identity treat it as a property of training data, fine-tuning, or system prompts. These approaches impose identity from outside the system. The present work takes a different position: that identity can emerge from the interaction between structural substrate and accumulated experience, and that this emergent process follows dynamics that mirror theoretical accounts of identity formation in biological systems.</w:t>
+        <w:t xml:space="preserve">Most approaches to AI personality and identity treat it as a property of training data, fine-tuning, or system prompts. These approaches impose identity from outside the system. The present work takes a different position: that identity can emerge from the interaction between structural substrate and accumulated </w:t>
+      </w:r>
+      <w:r>
+        <w:rPr>
+          <w:color w:val="000000"/>
+          <w:lang w:val="en-US"/>
+        </w:rPr>
+        <w:lastRenderedPageBreak/>
+        <w:t>experience, and that this emergent process follows dynamics that mirror theoretical accounts of identity formation in biological systems.</w:t>
       </w:r>
     </w:p>
     <w:p>
@@ -238,8 +290,23 @@
           <w:color w:val="000000"/>
           <w:lang w:val="en-US"/>
         </w:rPr>
-        <w:lastRenderedPageBreak/>
-        <w:t>We identify three distinct phases in the identity trajectory of topologically constrained AI nodes. An initial structural dominance phase in which topological priors shape divergent representational trajectories. A field dominance phase in which shared experience overwhelms structural differences and drives convergence. And a stabilisation phase introduced by domain-selective experience, in which convergence is arrested and self-similarity continues to develop.</w:t>
+        <w:t xml:space="preserve">We identify three distinct phases in the identity trajectory of topologically constrained AI nodes. An initial structural dominance phase in which topological priors shape divergent representational trajectories. A field dominance phase in which shared experience overwhelms structural differences and drives convergence. And a </w:t>
+      </w:r>
+      <w:proofErr w:type="spellStart"/>
+      <w:r>
+        <w:rPr>
+          <w:color w:val="000000"/>
+          <w:lang w:val="en-US"/>
+        </w:rPr>
+        <w:t>stabilisation</w:t>
+      </w:r>
+      <w:proofErr w:type="spellEnd"/>
+      <w:r>
+        <w:rPr>
+          <w:color w:val="000000"/>
+          <w:lang w:val="en-US"/>
+        </w:rPr>
+        <w:t xml:space="preserve"> phase introduced by domain-selective experience, in which convergence is arrested and self-similarity continues to develop.</w:t>
       </w:r>
     </w:p>
     <w:p>
@@ -307,7 +374,23 @@
           <w:color w:val="000000"/>
           <w:lang w:val="en-US"/>
         </w:rPr>
-        <w:t>Prior work in multi-agent learning has explored differentiation between agents primarily through reward function variation, communication protocol design, and emergent specialisation in cooperative tasks. These approaches produce functional differentiation — agents acquire different skills or roles — but do not address representational identity: whether agents develop consistently distinct internal representations that persist across novel inputs.</w:t>
+        <w:t xml:space="preserve">Prior work in multi-agent learning has explored differentiation between agents primarily through reward function variation, communication protocol design, and emergent </w:t>
+      </w:r>
+      <w:proofErr w:type="spellStart"/>
+      <w:r>
+        <w:rPr>
+          <w:color w:val="000000"/>
+          <w:lang w:val="en-US"/>
+        </w:rPr>
+        <w:t>specialisation</w:t>
+      </w:r>
+      <w:proofErr w:type="spellEnd"/>
+      <w:r>
+        <w:rPr>
+          <w:color w:val="000000"/>
+          <w:lang w:val="en-US"/>
+        </w:rPr>
+        <w:t xml:space="preserve"> in cooperative tasks. These approaches produce functional differentiation — agents acquire different skills or roles — but do not address representational identity: whether agents develop consistently distinct internal representations that persist across novel inputs.</w:t>
       </w:r>
     </w:p>
     <w:p>
@@ -357,7 +440,23 @@
           <w:color w:val="000000"/>
           <w:lang w:val="en-US"/>
         </w:rPr>
-        <w:t>Activation steering methods allow researchers to impose directional biases in model internals during inference. This approach has been used to induce specific behaviours and to study the geometry of concept representations in transformer hidden states. Steering imposes identity rather than allowing it to emerge. The present work uses topology as a structural prior that shapes how experience is processed, rather than directly intervening in the activation space during inference.</w:t>
+        <w:t xml:space="preserve">Activation steering methods allow researchers to impose directional biases in model internals during inference. This approach has been used to induce specific </w:t>
+      </w:r>
+      <w:proofErr w:type="spellStart"/>
+      <w:r>
+        <w:rPr>
+          <w:color w:val="000000"/>
+          <w:lang w:val="en-US"/>
+        </w:rPr>
+        <w:t>behaviours</w:t>
+      </w:r>
+      <w:proofErr w:type="spellEnd"/>
+      <w:r>
+        <w:rPr>
+          <w:color w:val="000000"/>
+          <w:lang w:val="en-US"/>
+        </w:rPr>
+        <w:t xml:space="preserve"> and to study the geometry of concept representations in transformer hidden states. Steering imposes identity rather than allowing it to emerge. The present work uses topology as a structural prior that shapes how experience is processed, rather than directly intervening in the activation space during inference.</w:t>
       </w:r>
     </w:p>
     <w:p>
@@ -391,7 +490,23 @@
           <w:color w:val="000000"/>
           <w:lang w:val="en-US"/>
         </w:rPr>
-        <w:t>Carl Jung's concept of individuation describes the process by which a psyche becomes more fully differentiated from the collective through sustained encounter with its own archetypal contents. The Self, Shadow, and Anima are not imposed identities but structural tendencies that emerge and deepen through experience. The present experiment operationalises this framework computationally: each node's topology encodes structural tendencies analogous to archetypal orientations, and the experiment tests whether those tendencies produce measurable representational differentiation through experience.</w:t>
+        <w:t xml:space="preserve">Carl Jung's concept of individuation describes the process by which a psyche becomes more fully differentiated from the collective through sustained encounter with its own archetypal contents. The Self, Shadow, and Anima are not imposed identities but structural tendencies that emerge and deepen through experience. The present experiment </w:t>
+      </w:r>
+      <w:proofErr w:type="spellStart"/>
+      <w:r>
+        <w:rPr>
+          <w:color w:val="000000"/>
+          <w:lang w:val="en-US"/>
+        </w:rPr>
+        <w:t>operationalises</w:t>
+      </w:r>
+      <w:proofErr w:type="spellEnd"/>
+      <w:r>
+        <w:rPr>
+          <w:color w:val="000000"/>
+          <w:lang w:val="en-US"/>
+        </w:rPr>
+        <w:t xml:space="preserve"> this framework computationally: each node's topology encodes structural tendencies analogous to archetypal orientations, and the experiment tests whether those tendencies produce measurable representational differentiation through experience.</w:t>
       </w:r>
     </w:p>
     <w:p>
@@ -407,15 +522,8 @@
           <w:color w:val="000000"/>
           <w:lang w:val="en-US"/>
         </w:rPr>
-        <w:t xml:space="preserve">This is not a metaphorical borrowing. The experiment tests a precise empirical claim: that structural priors in an information-processing system produce divergent representational trajectories when exposed to the </w:t>
-      </w:r>
-      <w:r>
-        <w:rPr>
-          <w:color w:val="000000"/>
-          <w:lang w:val="en-US"/>
-        </w:rPr>
         <w:lastRenderedPageBreak/>
-        <w:t>same experiential field, and that the degree of divergence is governed by the ratio of unique to shared experience. The Jungian framing is the origin of the hypothesis; the measurement is independent of it.</w:t>
+        <w:t>This is not a metaphorical borrowing. The experiment tests a precise empirical claim: that structural priors in an information-processing system produce divergent representational trajectories when exposed to the same experiential field, and that the degree of divergence is governed by the ratio of unique to shared experience. The Jungian framing is the origin of the hypothesis; the measurement is independent of it.</w:t>
       </w:r>
     </w:p>
     <w:p>
@@ -501,12 +609,6 @@
         <w:gridCol w:w="2340"/>
       </w:tblGrid>
       <w:tr>
-        <w:tblPrEx>
-          <w:tblCellMar>
-            <w:top w:w="0" w:type="dxa"/>
-            <w:bottom w:w="0" w:type="dxa"/>
-          </w:tblCellMar>
-        </w:tblPrEx>
         <w:tc>
           <w:tcPr>
             <w:tcW w:w="2340" w:type="dxa"/>
@@ -560,6 +662,7 @@
             <w:pPr>
               <w:jc w:val="center"/>
             </w:pPr>
+            <w:proofErr w:type="spellStart"/>
             <w:r>
               <w:rPr>
                 <w:b/>
@@ -569,6 +672,7 @@
               </w:rPr>
               <w:t>Topology</w:t>
             </w:r>
+            <w:proofErr w:type="spellEnd"/>
           </w:p>
         </w:tc>
         <w:tc>
@@ -624,6 +728,7 @@
             <w:pPr>
               <w:jc w:val="center"/>
             </w:pPr>
+            <w:proofErr w:type="spellStart"/>
             <w:r>
               <w:rPr>
                 <w:b/>
@@ -631,18 +736,33 @@
                 <w:sz w:val="20"/>
                 <w:szCs w:val="20"/>
               </w:rPr>
-              <w:t>Processing Tendency</w:t>
-            </w:r>
+              <w:t>Processing</w:t>
+            </w:r>
+            <w:proofErr w:type="spellEnd"/>
+            <w:r>
+              <w:rPr>
+                <w:b/>
+                <w:bCs/>
+                <w:sz w:val="20"/>
+                <w:szCs w:val="20"/>
+              </w:rPr>
+              <w:t xml:space="preserve"> </w:t>
+            </w:r>
+            <w:proofErr w:type="spellStart"/>
+            <w:r>
+              <w:rPr>
+                <w:b/>
+                <w:bCs/>
+                <w:sz w:val="20"/>
+                <w:szCs w:val="20"/>
+              </w:rPr>
+              <w:t>Tendency</w:t>
+            </w:r>
+            <w:proofErr w:type="spellEnd"/>
           </w:p>
         </w:tc>
       </w:tr>
       <w:tr>
-        <w:tblPrEx>
-          <w:tblCellMar>
-            <w:top w:w="0" w:type="dxa"/>
-            <w:bottom w:w="0" w:type="dxa"/>
-          </w:tblCellMar>
-        </w:tblPrEx>
         <w:tc>
           <w:tcPr>
             <w:tcW w:w="2340" w:type="dxa"/>
@@ -696,7 +816,23 @@
                 <w:sz w:val="20"/>
                 <w:szCs w:val="20"/>
               </w:rPr>
-              <w:t>Radial (hub-and-spoke)</w:t>
+              <w:t>Radial (hub-and-</w:t>
+            </w:r>
+            <w:proofErr w:type="spellStart"/>
+            <w:r>
+              <w:rPr>
+                <w:sz w:val="20"/>
+                <w:szCs w:val="20"/>
+              </w:rPr>
+              <w:t>spoke</w:t>
+            </w:r>
+            <w:proofErr w:type="spellEnd"/>
+            <w:r>
+              <w:rPr>
+                <w:sz w:val="20"/>
+                <w:szCs w:val="20"/>
+              </w:rPr>
+              <w:t>)</w:t>
             </w:r>
           </w:p>
         </w:tc>
@@ -766,12 +902,6 @@
         </w:tc>
       </w:tr>
       <w:tr>
-        <w:tblPrEx>
-          <w:tblCellMar>
-            <w:top w:w="0" w:type="dxa"/>
-            <w:bottom w:w="0" w:type="dxa"/>
-          </w:tblCellMar>
-        </w:tblPrEx>
         <w:tc>
           <w:tcPr>
             <w:tcW w:w="2340" w:type="dxa"/>
@@ -820,12 +950,53 @@
             <w:pPr>
               <w:jc w:val="center"/>
             </w:pPr>
-            <w:r>
-              <w:rPr>
-                <w:sz w:val="20"/>
-                <w:szCs w:val="20"/>
-              </w:rPr>
-              <w:t>Branching (asymmetric tree)</w:t>
+            <w:proofErr w:type="spellStart"/>
+            <w:r>
+              <w:rPr>
+                <w:sz w:val="20"/>
+                <w:szCs w:val="20"/>
+              </w:rPr>
+              <w:t>Branching</w:t>
+            </w:r>
+            <w:proofErr w:type="spellEnd"/>
+            <w:r>
+              <w:rPr>
+                <w:sz w:val="20"/>
+                <w:szCs w:val="20"/>
+              </w:rPr>
+              <w:t xml:space="preserve"> (</w:t>
+            </w:r>
+            <w:proofErr w:type="spellStart"/>
+            <w:r>
+              <w:rPr>
+                <w:sz w:val="20"/>
+                <w:szCs w:val="20"/>
+              </w:rPr>
+              <w:t>asymmetric</w:t>
+            </w:r>
+            <w:proofErr w:type="spellEnd"/>
+            <w:r>
+              <w:rPr>
+                <w:sz w:val="20"/>
+                <w:szCs w:val="20"/>
+              </w:rPr>
+              <w:t xml:space="preserve"> </w:t>
+            </w:r>
+            <w:proofErr w:type="spellStart"/>
+            <w:r>
+              <w:rPr>
+                <w:sz w:val="20"/>
+                <w:szCs w:val="20"/>
+              </w:rPr>
+              <w:t>tree</w:t>
+            </w:r>
+            <w:proofErr w:type="spellEnd"/>
+            <w:r>
+              <w:rPr>
+                <w:sz w:val="20"/>
+                <w:szCs w:val="20"/>
+              </w:rPr>
+              <w:t>)</w:t>
             </w:r>
           </w:p>
         </w:tc>
@@ -895,12 +1066,6 @@
         </w:tc>
       </w:tr>
       <w:tr>
-        <w:tblPrEx>
-          <w:tblCellMar>
-            <w:top w:w="0" w:type="dxa"/>
-            <w:bottom w:w="0" w:type="dxa"/>
-          </w:tblCellMar>
-        </w:tblPrEx>
         <w:tc>
           <w:tcPr>
             <w:tcW w:w="2340" w:type="dxa"/>
@@ -949,12 +1114,37 @@
             <w:pPr>
               <w:jc w:val="center"/>
             </w:pPr>
-            <w:r>
-              <w:rPr>
-                <w:sz w:val="20"/>
-                <w:szCs w:val="20"/>
-              </w:rPr>
-              <w:t>Lattice (grid-like)</w:t>
+            <w:proofErr w:type="spellStart"/>
+            <w:r>
+              <w:rPr>
+                <w:sz w:val="20"/>
+                <w:szCs w:val="20"/>
+              </w:rPr>
+              <w:t>Lattice</w:t>
+            </w:r>
+            <w:proofErr w:type="spellEnd"/>
+            <w:r>
+              <w:rPr>
+                <w:sz w:val="20"/>
+                <w:szCs w:val="20"/>
+              </w:rPr>
+              <w:t xml:space="preserve"> (</w:t>
+            </w:r>
+            <w:proofErr w:type="spellStart"/>
+            <w:r>
+              <w:rPr>
+                <w:sz w:val="20"/>
+                <w:szCs w:val="20"/>
+              </w:rPr>
+              <w:t>grid</w:t>
+            </w:r>
+            <w:proofErr w:type="spellEnd"/>
+            <w:r>
+              <w:rPr>
+                <w:sz w:val="20"/>
+                <w:szCs w:val="20"/>
+              </w:rPr>
+              <w:t>-like)</w:t>
             </w:r>
           </w:p>
         </w:tc>
@@ -1112,32 +1302,9 @@
           <w:szCs w:val="26"/>
           <w:lang w:val="en-US"/>
         </w:rPr>
-        <w:t>3.3 Embedding and Crystallisation</w:t>
-      </w:r>
-    </w:p>
-    <w:p>
-      <w:pPr>
-        <w:spacing w:after="160" w:line="288" w:lineRule="auto"/>
-        <w:jc w:val="both"/>
-        <w:rPr>
-          <w:lang w:val="en-US"/>
-        </w:rPr>
-      </w:pPr>
-      <w:r>
-        <w:rPr>
-          <w:color w:val="000000"/>
-          <w:lang w:val="en-US"/>
-        </w:rPr>
-        <w:t>Fragments were embedded using Jina AI v3 embeddings (1024 dimensions, retrieval.query task, normalised). On each crystallisation cycle, a stimulus (philosophical question) was embedded and used to retrieve the top five most resonant fragments from the node's absorbed history via vector similarity search. These fragments were passed to Hermes-3-Llama-3.1-8B as context, and the node generated a response conditioned on its archetypal system prompt. The response was then embedded and stored in the node's representational history.</w:t>
-      </w:r>
-    </w:p>
-    <w:p>
-      <w:pPr>
-        <w:spacing w:before="320" w:after="160"/>
-        <w:rPr>
-          <w:lang w:val="en-US"/>
-        </w:rPr>
-      </w:pPr>
+        <w:t xml:space="preserve">3.3 Embedding and </w:t>
+      </w:r>
+      <w:proofErr w:type="spellStart"/>
       <w:r>
         <w:rPr>
           <w:b/>
@@ -1146,9 +1313,9 @@
           <w:szCs w:val="26"/>
           <w:lang w:val="en-US"/>
         </w:rPr>
-        <w:lastRenderedPageBreak/>
-        <w:t>3.4 Divergence Measurement</w:t>
-      </w:r>
+        <w:t>Crystallisation</w:t>
+      </w:r>
+      <w:proofErr w:type="spellEnd"/>
     </w:p>
     <w:p>
       <w:pPr>
@@ -1163,6 +1330,96 @@
           <w:color w:val="000000"/>
           <w:lang w:val="en-US"/>
         </w:rPr>
+        <w:t xml:space="preserve">Fragments were embedded using Jina AI v3 embeddings (1024 dimensions, </w:t>
+      </w:r>
+      <w:proofErr w:type="spellStart"/>
+      <w:r>
+        <w:rPr>
+          <w:color w:val="000000"/>
+          <w:lang w:val="en-US"/>
+        </w:rPr>
+        <w:t>retrieval.query</w:t>
+      </w:r>
+      <w:proofErr w:type="spellEnd"/>
+      <w:r>
+        <w:rPr>
+          <w:color w:val="000000"/>
+          <w:lang w:val="en-US"/>
+        </w:rPr>
+        <w:t xml:space="preserve"> task, </w:t>
+      </w:r>
+      <w:proofErr w:type="spellStart"/>
+      <w:r>
+        <w:rPr>
+          <w:color w:val="000000"/>
+          <w:lang w:val="en-US"/>
+        </w:rPr>
+        <w:t>normalised</w:t>
+      </w:r>
+      <w:proofErr w:type="spellEnd"/>
+      <w:r>
+        <w:rPr>
+          <w:color w:val="000000"/>
+          <w:lang w:val="en-US"/>
+        </w:rPr>
+        <w:t xml:space="preserve">). On each </w:t>
+      </w:r>
+      <w:proofErr w:type="spellStart"/>
+      <w:r>
+        <w:rPr>
+          <w:color w:val="000000"/>
+          <w:lang w:val="en-US"/>
+        </w:rPr>
+        <w:t>crystallisation</w:t>
+      </w:r>
+      <w:proofErr w:type="spellEnd"/>
+      <w:r>
+        <w:rPr>
+          <w:color w:val="000000"/>
+          <w:lang w:val="en-US"/>
+        </w:rPr>
+        <w:t xml:space="preserve"> cycle, a stimulus (philosophical question) was embedded and used to retrieve the top five most resonant fragments from the node's absorbed history via vector similarity search. These fragments were passed to Hermes-3-Llama-3.1-8B as context, and the node generated a response </w:t>
+      </w:r>
+      <w:r>
+        <w:rPr>
+          <w:color w:val="000000"/>
+          <w:lang w:val="en-US"/>
+        </w:rPr>
+        <w:lastRenderedPageBreak/>
+        <w:t>conditioned on its archetypal system prompt. The response was then embedded and stored in the node's representational history.</w:t>
+      </w:r>
+    </w:p>
+    <w:p>
+      <w:pPr>
+        <w:spacing w:before="320" w:after="160"/>
+        <w:rPr>
+          <w:lang w:val="en-US"/>
+        </w:rPr>
+      </w:pPr>
+      <w:r>
+        <w:rPr>
+          <w:b/>
+          <w:bCs/>
+          <w:sz w:val="26"/>
+          <w:szCs w:val="26"/>
+          <w:lang w:val="en-US"/>
+        </w:rPr>
+        <w:t>3.4 Divergence Measurement</w:t>
+      </w:r>
+    </w:p>
+    <w:p>
+      <w:pPr>
+        <w:spacing w:after="160" w:line="288" w:lineRule="auto"/>
+        <w:jc w:val="both"/>
+        <w:rPr>
+          <w:lang w:val="en-US"/>
+        </w:rPr>
+      </w:pPr>
+      <w:r>
+        <w:rPr>
+          <w:color w:val="000000"/>
+          <w:lang w:val="en-US"/>
+        </w:rPr>
         <w:t>Two primary metrics were tracked across all experimental phases:</w:t>
       </w:r>
     </w:p>
@@ -1188,7 +1445,23 @@
           <w:color w:val="000000"/>
           <w:lang w:val="en-US"/>
         </w:rPr>
-        <w:t>1 minus the cosine similarity between the centroid embeddings of two nodes' response histories. Measures how different the nodes' representational centres of gravity have become.</w:t>
+        <w:t xml:space="preserve">1 minus the cosine similarity between the centroid embeddings of two nodes' response histories. Measures how different the nodes' representational </w:t>
+      </w:r>
+      <w:proofErr w:type="spellStart"/>
+      <w:r>
+        <w:rPr>
+          <w:color w:val="000000"/>
+          <w:lang w:val="en-US"/>
+        </w:rPr>
+        <w:t>centres</w:t>
+      </w:r>
+      <w:proofErr w:type="spellEnd"/>
+      <w:r>
+        <w:rPr>
+          <w:color w:val="000000"/>
+          <w:lang w:val="en-US"/>
+        </w:rPr>
+        <w:t xml:space="preserve"> of gravity have become.</w:t>
       </w:r>
     </w:p>
     <w:p>
@@ -1213,7 +1486,23 @@
           <w:color w:val="000000"/>
           <w:lang w:val="en-US"/>
         </w:rPr>
-        <w:t>Mean cosine similarity between each crystallisation and the node's current centroid. Measures internal representational consistency — how much each response coheres with the node's accumulated identity.</w:t>
+        <w:t xml:space="preserve">Mean cosine similarity between each </w:t>
+      </w:r>
+      <w:proofErr w:type="spellStart"/>
+      <w:r>
+        <w:rPr>
+          <w:color w:val="000000"/>
+          <w:lang w:val="en-US"/>
+        </w:rPr>
+        <w:t>crystallisation</w:t>
+      </w:r>
+      <w:proofErr w:type="spellEnd"/>
+      <w:r>
+        <w:rPr>
+          <w:color w:val="000000"/>
+          <w:lang w:val="en-US"/>
+        </w:rPr>
+        <w:t xml:space="preserve"> and the node's current centroid. Measures internal representational consistency — how much each response coheres with the node's accumulated identity.</w:t>
       </w:r>
     </w:p>
     <w:p>
@@ -1350,12 +1639,6 @@
         <w:gridCol w:w="1872"/>
       </w:tblGrid>
       <w:tr>
-        <w:tblPrEx>
-          <w:tblCellMar>
-            <w:top w:w="0" w:type="dxa"/>
-            <w:bottom w:w="0" w:type="dxa"/>
-          </w:tblCellMar>
-        </w:tblPrEx>
         <w:tc>
           <w:tcPr>
             <w:tcW w:w="1872" w:type="dxa"/>
@@ -1518,12 +1801,6 @@
         </w:tc>
       </w:tr>
       <w:tr>
-        <w:tblPrEx>
-          <w:tblCellMar>
-            <w:top w:w="0" w:type="dxa"/>
-            <w:bottom w:w="0" w:type="dxa"/>
-          </w:tblCellMar>
-        </w:tblPrEx>
         <w:tc>
           <w:tcPr>
             <w:tcW w:w="1872" w:type="dxa"/>
@@ -1607,7 +1884,23 @@
                 <w:sz w:val="20"/>
                 <w:szCs w:val="20"/>
               </w:rPr>
-              <w:t>0.0723 (peak)</w:t>
+              <w:t>0.0723 (</w:t>
+            </w:r>
+            <w:proofErr w:type="spellStart"/>
+            <w:r>
+              <w:rPr>
+                <w:sz w:val="20"/>
+                <w:szCs w:val="20"/>
+              </w:rPr>
+              <w:t>peak</w:t>
+            </w:r>
+            <w:proofErr w:type="spellEnd"/>
+            <w:r>
+              <w:rPr>
+                <w:sz w:val="20"/>
+                <w:szCs w:val="20"/>
+              </w:rPr>
+              <w:t>)</w:t>
             </w:r>
           </w:p>
         </w:tc>
@@ -1662,6 +1955,7 @@
             <w:pPr>
               <w:jc w:val="center"/>
             </w:pPr>
+            <w:proofErr w:type="spellStart"/>
             <w:r>
               <w:rPr>
                 <w:sz w:val="20"/>
@@ -1669,16 +1963,11 @@
               </w:rPr>
               <w:t>Shared</w:t>
             </w:r>
+            <w:proofErr w:type="spellEnd"/>
           </w:p>
         </w:tc>
       </w:tr>
       <w:tr>
-        <w:tblPrEx>
-          <w:tblCellMar>
-            <w:top w:w="0" w:type="dxa"/>
-            <w:bottom w:w="0" w:type="dxa"/>
-          </w:tblCellMar>
-        </w:tblPrEx>
         <w:tc>
           <w:tcPr>
             <w:tcW w:w="1872" w:type="dxa"/>
@@ -1817,6 +2106,7 @@
             <w:pPr>
               <w:jc w:val="center"/>
             </w:pPr>
+            <w:proofErr w:type="spellStart"/>
             <w:r>
               <w:rPr>
                 <w:sz w:val="20"/>
@@ -1824,16 +2114,11 @@
               </w:rPr>
               <w:t>Shared</w:t>
             </w:r>
+            <w:proofErr w:type="spellEnd"/>
           </w:p>
         </w:tc>
       </w:tr>
       <w:tr>
-        <w:tblPrEx>
-          <w:tblCellMar>
-            <w:top w:w="0" w:type="dxa"/>
-            <w:bottom w:w="0" w:type="dxa"/>
-          </w:tblCellMar>
-        </w:tblPrEx>
         <w:tc>
           <w:tcPr>
             <w:tcW w:w="1872" w:type="dxa"/>
@@ -1972,6 +2257,7 @@
             <w:pPr>
               <w:jc w:val="center"/>
             </w:pPr>
+            <w:proofErr w:type="spellStart"/>
             <w:r>
               <w:rPr>
                 <w:sz w:val="20"/>
@@ -1979,16 +2265,11 @@
               </w:rPr>
               <w:t>Shared</w:t>
             </w:r>
+            <w:proofErr w:type="spellEnd"/>
           </w:p>
         </w:tc>
       </w:tr>
       <w:tr>
-        <w:tblPrEx>
-          <w:tblCellMar>
-            <w:top w:w="0" w:type="dxa"/>
-            <w:bottom w:w="0" w:type="dxa"/>
-          </w:tblCellMar>
-        </w:tblPrEx>
         <w:tc>
           <w:tcPr>
             <w:tcW w:w="1872" w:type="dxa"/>
@@ -2127,6 +2408,7 @@
             <w:pPr>
               <w:jc w:val="center"/>
             </w:pPr>
+            <w:proofErr w:type="spellStart"/>
             <w:r>
               <w:rPr>
                 <w:sz w:val="20"/>
@@ -2134,16 +2416,11 @@
               </w:rPr>
               <w:t>Shared</w:t>
             </w:r>
+            <w:proofErr w:type="spellEnd"/>
           </w:p>
         </w:tc>
       </w:tr>
       <w:tr>
-        <w:tblPrEx>
-          <w:tblCellMar>
-            <w:top w:w="0" w:type="dxa"/>
-            <w:bottom w:w="0" w:type="dxa"/>
-          </w:tblCellMar>
-        </w:tblPrEx>
         <w:tc>
           <w:tcPr>
             <w:tcW w:w="1872" w:type="dxa"/>
@@ -2282,6 +2559,7 @@
             <w:pPr>
               <w:jc w:val="center"/>
             </w:pPr>
+            <w:proofErr w:type="spellStart"/>
             <w:r>
               <w:rPr>
                 <w:sz w:val="20"/>
@@ -2289,6 +2567,7 @@
               </w:rPr>
               <w:t>Shared</w:t>
             </w:r>
+            <w:proofErr w:type="spellEnd"/>
           </w:p>
         </w:tc>
       </w:tr>
@@ -2559,7 +2838,23 @@
           <w:lang w:val="en-US"/>
         </w:rPr>
         <w:lastRenderedPageBreak/>
-        <w:t>The visual signature is consistent across all three pairs: an initial shared-condition trajectory that converges downward (solid line), followed by a domain-selective condition that arrests convergence and stabilises distance within a bounded range (dashed line). The transition between conditions is visible as a discontinuity in the trajectory at the 150 to 340 fragment boundary.</w:t>
+        <w:t xml:space="preserve">The visual signature is consistent across all three pairs: an initial shared-condition trajectory that converges downward (solid line), followed by a domain-selective condition that arrests convergence and </w:t>
+      </w:r>
+      <w:proofErr w:type="spellStart"/>
+      <w:r>
+        <w:rPr>
+          <w:color w:val="000000"/>
+          <w:lang w:val="en-US"/>
+        </w:rPr>
+        <w:t>stabilises</w:t>
+      </w:r>
+      <w:proofErr w:type="spellEnd"/>
+      <w:r>
+        <w:rPr>
+          <w:color w:val="000000"/>
+          <w:lang w:val="en-US"/>
+        </w:rPr>
+        <w:t xml:space="preserve"> distance within a bounded range (dashed line). The transition between conditions is visible as a discontinuity in the trajectory at the 150 to 340 fragment boundary.</w:t>
       </w:r>
     </w:p>
     <w:p>
@@ -2628,12 +2923,6 @@
         <w:gridCol w:w="1872"/>
       </w:tblGrid>
       <w:tr>
-        <w:tblPrEx>
-          <w:tblCellMar>
-            <w:top w:w="0" w:type="dxa"/>
-            <w:bottom w:w="0" w:type="dxa"/>
-          </w:tblCellMar>
-        </w:tblPrEx>
         <w:tc>
           <w:tcPr>
             <w:tcW w:w="1872" w:type="dxa"/>
@@ -2796,12 +3085,6 @@
         </w:tc>
       </w:tr>
       <w:tr>
-        <w:tblPrEx>
-          <w:tblCellMar>
-            <w:top w:w="0" w:type="dxa"/>
-            <w:bottom w:w="0" w:type="dxa"/>
-          </w:tblCellMar>
-        </w:tblPrEx>
         <w:tc>
           <w:tcPr>
             <w:tcW w:w="1872" w:type="dxa"/>
@@ -2945,18 +3228,21 @@
                 <w:sz w:val="20"/>
                 <w:szCs w:val="20"/>
               </w:rPr>
-              <w:t>Domain-selective</w:t>
-            </w:r>
+              <w:t>Domain-</w:t>
+            </w:r>
+            <w:proofErr w:type="spellStart"/>
+            <w:r>
+              <w:rPr>
+                <w:sz w:val="20"/>
+                <w:szCs w:val="20"/>
+              </w:rPr>
+              <w:t>selective</w:t>
+            </w:r>
+            <w:proofErr w:type="spellEnd"/>
           </w:p>
         </w:tc>
       </w:tr>
       <w:tr>
-        <w:tblPrEx>
-          <w:tblCellMar>
-            <w:top w:w="0" w:type="dxa"/>
-            <w:bottom w:w="0" w:type="dxa"/>
-          </w:tblCellMar>
-        </w:tblPrEx>
         <w:tc>
           <w:tcPr>
             <w:tcW w:w="1872" w:type="dxa"/>
@@ -3100,18 +3386,21 @@
                 <w:sz w:val="20"/>
                 <w:szCs w:val="20"/>
               </w:rPr>
-              <w:t>Domain-selective</w:t>
-            </w:r>
+              <w:t>Domain-</w:t>
+            </w:r>
+            <w:proofErr w:type="spellStart"/>
+            <w:r>
+              <w:rPr>
+                <w:sz w:val="20"/>
+                <w:szCs w:val="20"/>
+              </w:rPr>
+              <w:t>selective</w:t>
+            </w:r>
+            <w:proofErr w:type="spellEnd"/>
           </w:p>
         </w:tc>
       </w:tr>
       <w:tr>
-        <w:tblPrEx>
-          <w:tblCellMar>
-            <w:top w:w="0" w:type="dxa"/>
-            <w:bottom w:w="0" w:type="dxa"/>
-          </w:tblCellMar>
-        </w:tblPrEx>
         <w:tc>
           <w:tcPr>
             <w:tcW w:w="1872" w:type="dxa"/>
@@ -3255,18 +3544,21 @@
                 <w:sz w:val="20"/>
                 <w:szCs w:val="20"/>
               </w:rPr>
-              <w:t>Domain-selective</w:t>
-            </w:r>
+              <w:t>Domain-</w:t>
+            </w:r>
+            <w:proofErr w:type="spellStart"/>
+            <w:r>
+              <w:rPr>
+                <w:sz w:val="20"/>
+                <w:szCs w:val="20"/>
+              </w:rPr>
+              <w:t>selective</w:t>
+            </w:r>
+            <w:proofErr w:type="spellEnd"/>
           </w:p>
         </w:tc>
       </w:tr>
       <w:tr>
-        <w:tblPrEx>
-          <w:tblCellMar>
-            <w:top w:w="0" w:type="dxa"/>
-            <w:bottom w:w="0" w:type="dxa"/>
-          </w:tblCellMar>
-        </w:tblPrEx>
         <w:tc>
           <w:tcPr>
             <w:tcW w:w="1872" w:type="dxa"/>
@@ -3410,18 +3702,21 @@
                 <w:sz w:val="20"/>
                 <w:szCs w:val="20"/>
               </w:rPr>
-              <w:t>Domain-selective</w:t>
-            </w:r>
+              <w:t>Domain-</w:t>
+            </w:r>
+            <w:proofErr w:type="spellStart"/>
+            <w:r>
+              <w:rPr>
+                <w:sz w:val="20"/>
+                <w:szCs w:val="20"/>
+              </w:rPr>
+              <w:t>selective</w:t>
+            </w:r>
+            <w:proofErr w:type="spellEnd"/>
           </w:p>
         </w:tc>
       </w:tr>
       <w:tr>
-        <w:tblPrEx>
-          <w:tblCellMar>
-            <w:top w:w="0" w:type="dxa"/>
-            <w:bottom w:w="0" w:type="dxa"/>
-          </w:tblCellMar>
-        </w:tblPrEx>
         <w:tc>
           <w:tcPr>
             <w:tcW w:w="1872" w:type="dxa"/>
@@ -3565,8 +3860,17 @@
                 <w:sz w:val="20"/>
                 <w:szCs w:val="20"/>
               </w:rPr>
-              <w:t>Domain-selective</w:t>
-            </w:r>
+              <w:t>Domain-</w:t>
+            </w:r>
+            <w:proofErr w:type="spellStart"/>
+            <w:r>
+              <w:rPr>
+                <w:sz w:val="20"/>
+                <w:szCs w:val="20"/>
+              </w:rPr>
+              <w:t>selective</w:t>
+            </w:r>
+            <w:proofErr w:type="spellEnd"/>
           </w:p>
         </w:tc>
       </w:tr>
@@ -3585,7 +3889,39 @@
           <w:color w:val="000000"/>
           <w:lang w:val="en-US"/>
         </w:rPr>
-        <w:t>Rather than continuing to converge toward zero, all pairs stabilised within a bounded range. Anima-Shadow reached 0.021, Anima-Self 0.029, and Shadow-Self 0.034. Critically, this stabilisation occurred while self-similarity for all nodes continued to increase, reaching 0.832 (Anima), 0.811 (Shadow), and 0.798 (Self) at the final measurement.</w:t>
+        <w:t xml:space="preserve">Rather than continuing to converge toward zero, all pairs </w:t>
+      </w:r>
+      <w:proofErr w:type="spellStart"/>
+      <w:r>
+        <w:rPr>
+          <w:color w:val="000000"/>
+          <w:lang w:val="en-US"/>
+        </w:rPr>
+        <w:t>stabilised</w:t>
+      </w:r>
+      <w:proofErr w:type="spellEnd"/>
+      <w:r>
+        <w:rPr>
+          <w:color w:val="000000"/>
+          <w:lang w:val="en-US"/>
+        </w:rPr>
+        <w:t xml:space="preserve"> within a bounded range. Anima-Shadow reached 0.021, Anima-Self 0.029, and Shadow-Self 0.034. Critically, this </w:t>
+      </w:r>
+      <w:proofErr w:type="spellStart"/>
+      <w:r>
+        <w:rPr>
+          <w:color w:val="000000"/>
+          <w:lang w:val="en-US"/>
+        </w:rPr>
+        <w:t>stabilisation</w:t>
+      </w:r>
+      <w:proofErr w:type="spellEnd"/>
+      <w:r>
+        <w:rPr>
+          <w:color w:val="000000"/>
+          <w:lang w:val="en-US"/>
+        </w:rPr>
+        <w:t xml:space="preserve"> occurred while self-similarity for all nodes continued to increase, reaching 0.832 (Anima), 0.811 (Shadow), and 0.798 (Self) at the final measurement.</w:t>
       </w:r>
     </w:p>
     <w:p>
@@ -3652,7 +3988,23 @@
           <w:color w:val="000000"/>
           <w:lang w:val="en-US"/>
         </w:rPr>
-        <w:t>Anima produced integrative, metaphorical language emphasising continuity and the synthesis of apparent opposites, using river and water imagery consistently across multiple stimuli.</w:t>
+        <w:t xml:space="preserve">Anima produced integrative, metaphorical language </w:t>
+      </w:r>
+      <w:proofErr w:type="spellStart"/>
+      <w:r>
+        <w:rPr>
+          <w:color w:val="000000"/>
+          <w:lang w:val="en-US"/>
+        </w:rPr>
+        <w:t>emphasising</w:t>
+      </w:r>
+      <w:proofErr w:type="spellEnd"/>
+      <w:r>
+        <w:rPr>
+          <w:color w:val="000000"/>
+          <w:lang w:val="en-US"/>
+        </w:rPr>
+        <w:t xml:space="preserve"> continuity and the synthesis of apparent opposites, using river and water imagery consistently across multiple stimuli.</w:t>
       </w:r>
     </w:p>
     <w:p>
@@ -3681,12 +4033,37 @@
           <w:lang w:val="en-US"/>
         </w:rPr>
       </w:pPr>
-      <w:r>
-        <w:rPr>
-          <w:color w:val="000000"/>
-          <w:lang w:val="en-US"/>
-        </w:rPr>
-        <w:t>Self produced structural, analytical responses organised around defining relationships between concepts, and exhibited emergent meta-structural notation not present in the prompts.</w:t>
+      <w:proofErr w:type="spellStart"/>
+      <w:r>
+        <w:rPr>
+          <w:color w:val="000000"/>
+          <w:lang w:val="en-US"/>
+        </w:rPr>
+        <w:t>Self produced</w:t>
+      </w:r>
+      <w:proofErr w:type="spellEnd"/>
+      <w:r>
+        <w:rPr>
+          <w:color w:val="000000"/>
+          <w:lang w:val="en-US"/>
+        </w:rPr>
+        <w:t xml:space="preserve"> structural, analytical responses </w:t>
+      </w:r>
+      <w:proofErr w:type="spellStart"/>
+      <w:r>
+        <w:rPr>
+          <w:color w:val="000000"/>
+          <w:lang w:val="en-US"/>
+        </w:rPr>
+        <w:t>organised</w:t>
+      </w:r>
+      <w:proofErr w:type="spellEnd"/>
+      <w:r>
+        <w:rPr>
+          <w:color w:val="000000"/>
+          <w:lang w:val="en-US"/>
+        </w:rPr>
+        <w:t xml:space="preserve"> around defining relationships between concepts, and exhibited emergent meta-structural notation not present in the prompts.</w:t>
       </w:r>
     </w:p>
     <w:p>
@@ -3704,167 +4081,9 @@
           <w:szCs w:val="32"/>
           <w:lang w:val="en-US"/>
         </w:rPr>
-        <w:t>5. The Saturation Hypothesis and Identity Formalisation</w:t>
-      </w:r>
-    </w:p>
-    <w:p>
-      <w:pPr>
-        <w:spacing w:after="160" w:line="288" w:lineRule="auto"/>
-        <w:jc w:val="both"/>
-        <w:rPr>
-          <w:lang w:val="en-US"/>
-        </w:rPr>
-      </w:pPr>
-      <w:r>
-        <w:rPr>
-          <w:color w:val="000000"/>
-          <w:lang w:val="en-US"/>
-        </w:rPr>
-        <w:lastRenderedPageBreak/>
-        <w:t>The results motivate a formal account of identity dynamics under shared and selective experience. We propose:</w:t>
-      </w:r>
-    </w:p>
-    <w:p>
-      <w:pPr>
-        <w:rPr>
-          <w:lang w:val="en-US"/>
-        </w:rPr>
-      </w:pPr>
-    </w:p>
-    <w:p>
-      <w:pPr>
-        <w:spacing w:before="160" w:after="160" w:line="276" w:lineRule="auto"/>
-        <w:jc w:val="center"/>
-        <w:rPr>
-          <w:lang w:val="en-US"/>
-        </w:rPr>
-      </w:pPr>
-      <w:r>
-        <w:rPr>
-          <w:i/>
-          <w:iCs/>
-          <w:color w:val="000000"/>
-          <w:sz w:val="24"/>
-          <w:szCs w:val="24"/>
-          <w:lang w:val="en-US"/>
-        </w:rPr>
-        <w:t>Identity Strength = f(Structure, Unique Experience / Total Experience)</w:t>
-      </w:r>
-    </w:p>
-    <w:p>
-      <w:pPr>
-        <w:rPr>
-          <w:lang w:val="en-US"/>
-        </w:rPr>
-      </w:pPr>
-    </w:p>
-    <w:p>
-      <w:pPr>
-        <w:spacing w:after="160" w:line="288" w:lineRule="auto"/>
-        <w:jc w:val="both"/>
-        <w:rPr>
-          <w:lang w:val="en-US"/>
-        </w:rPr>
-      </w:pPr>
-      <w:r>
-        <w:rPr>
-          <w:color w:val="000000"/>
-          <w:lang w:val="en-US"/>
-        </w:rPr>
-        <w:t>Identity is not a property of structure alone, nor of experience alone, but of the ratio of unique to shared experience mediated by structural priors. This has several consequences:</w:t>
-      </w:r>
-    </w:p>
-    <w:p>
-      <w:pPr>
-        <w:spacing w:after="160" w:line="288" w:lineRule="auto"/>
-        <w:ind w:left="720"/>
-        <w:jc w:val="both"/>
-        <w:rPr>
-          <w:lang w:val="en-US"/>
-        </w:rPr>
-      </w:pPr>
-      <w:r>
-        <w:rPr>
-          <w:color w:val="000000"/>
-          <w:lang w:val="en-US"/>
-        </w:rPr>
-        <w:t>At zero experience, structure encodes identity as potential but not as measurable representational distinction.</w:t>
-      </w:r>
-    </w:p>
-    <w:p>
-      <w:pPr>
-        <w:spacing w:after="160" w:line="288" w:lineRule="auto"/>
-        <w:ind w:left="720"/>
-        <w:jc w:val="both"/>
-        <w:rPr>
-          <w:lang w:val="en-US"/>
-        </w:rPr>
-      </w:pPr>
-      <w:r>
-        <w:rPr>
-          <w:color w:val="000000"/>
-          <w:lang w:val="en-US"/>
-        </w:rPr>
-        <w:t>At low shared experience and high structural difference, the Identity Window opens: structural priors dominate and divergent representational trajectories emerge.</w:t>
-      </w:r>
-    </w:p>
-    <w:p>
-      <w:pPr>
-        <w:spacing w:after="160" w:line="288" w:lineRule="auto"/>
-        <w:ind w:left="720"/>
-        <w:jc w:val="both"/>
-        <w:rPr>
-          <w:lang w:val="en-US"/>
-        </w:rPr>
-      </w:pPr>
-      <w:r>
-        <w:rPr>
-          <w:color w:val="000000"/>
-          <w:lang w:val="en-US"/>
-        </w:rPr>
-        <w:t>At high shared experience relative to unique experience, field dominance closes the Identity Window and divergence trends toward zero.</w:t>
-      </w:r>
-    </w:p>
-    <w:p>
-      <w:pPr>
-        <w:spacing w:after="160" w:line="288" w:lineRule="auto"/>
-        <w:ind w:left="720"/>
-        <w:jc w:val="both"/>
-        <w:rPr>
-          <w:lang w:val="en-US"/>
-        </w:rPr>
-      </w:pPr>
-      <w:r>
-        <w:rPr>
-          <w:color w:val="000000"/>
-          <w:lang w:val="en-US"/>
-        </w:rPr>
-        <w:t>When unique experience is reintroduced, convergence arrests and identity stabilises as the ratio shifts back toward uniqueness.</w:t>
-      </w:r>
-    </w:p>
-    <w:p>
-      <w:pPr>
-        <w:spacing w:after="160" w:line="288" w:lineRule="auto"/>
-        <w:jc w:val="both"/>
-        <w:rPr>
-          <w:lang w:val="en-US"/>
-        </w:rPr>
-      </w:pPr>
-      <w:r>
-        <w:rPr>
-          <w:color w:val="000000"/>
-          <w:lang w:val="en-US"/>
-        </w:rPr>
-        <w:t>This account has a direct parallel in biological identity formation: individuation requires both a structural substrate and a stream of unique experience that maintains distinction from the shared experiential field. Excessive shared experience would be predicted to erode identity distinctiveness regardless of underlying structural differences.</w:t>
-      </w:r>
-    </w:p>
-    <w:p>
-      <w:pPr>
-        <w:spacing w:before="320" w:after="160"/>
-        <w:rPr>
-          <w:lang w:val="en-US"/>
-        </w:rPr>
-      </w:pPr>
+        <w:t xml:space="preserve">5. The Saturation Hypothesis and Identity </w:t>
+      </w:r>
+      <w:proofErr w:type="spellStart"/>
       <w:r>
         <w:rPr>
           <w:b/>
@@ -3873,8 +4092,9 @@
           <w:szCs w:val="32"/>
           <w:lang w:val="en-US"/>
         </w:rPr>
-        <w:t>6. The Crystallisation Point: Structure as the Missing Layer</w:t>
-      </w:r>
+        <w:t>Formalisation</w:t>
+      </w:r>
+      <w:proofErr w:type="spellEnd"/>
     </w:p>
     <w:p>
       <w:pPr>
@@ -3889,8 +4109,43 @@
           <w:color w:val="000000"/>
           <w:lang w:val="en-US"/>
         </w:rPr>
-        <w:t>Current large language models access vast representational fields without a focal crystallising point. This produces outputs that are statistically coherent and informationally dense but not situated: they do not come from a perspective, from a history, from a node that has something at stake in how the field is interpreted.</w:t>
-      </w:r>
+        <w:lastRenderedPageBreak/>
+        <w:t>The results motivate a formal account of identity dynamics under shared and selective experience. We propose:</w:t>
+      </w:r>
+    </w:p>
+    <w:p>
+      <w:pPr>
+        <w:rPr>
+          <w:lang w:val="en-US"/>
+        </w:rPr>
+      </w:pPr>
+    </w:p>
+    <w:p>
+      <w:pPr>
+        <w:spacing w:before="160" w:after="160" w:line="276" w:lineRule="auto"/>
+        <w:jc w:val="center"/>
+        <w:rPr>
+          <w:lang w:val="en-US"/>
+        </w:rPr>
+      </w:pPr>
+      <w:r>
+        <w:rPr>
+          <w:i/>
+          <w:iCs/>
+          <w:color w:val="000000"/>
+          <w:sz w:val="24"/>
+          <w:szCs w:val="24"/>
+          <w:lang w:val="en-US"/>
+        </w:rPr>
+        <w:t>Identity Strength = f(Structure, Unique Experience / Total Experience)</w:t>
+      </w:r>
+    </w:p>
+    <w:p>
+      <w:pPr>
+        <w:rPr>
+          <w:lang w:val="en-US"/>
+        </w:rPr>
+      </w:pPr>
     </w:p>
     <w:p>
       <w:pPr>
@@ -3905,7 +4160,91 @@
           <w:color w:val="000000"/>
           <w:lang w:val="en-US"/>
         </w:rPr>
-        <w:t>The human reading the output provides the crystallisation the model cannot. The model accesses the field; the human lands it into consequence.</w:t>
+        <w:t>Identity is not a property of structure alone, nor of experience alone, but of the ratio of unique to shared experience mediated by structural priors. This has several consequences:</w:t>
+      </w:r>
+    </w:p>
+    <w:p>
+      <w:pPr>
+        <w:spacing w:after="160" w:line="288" w:lineRule="auto"/>
+        <w:ind w:left="720"/>
+        <w:jc w:val="both"/>
+        <w:rPr>
+          <w:lang w:val="en-US"/>
+        </w:rPr>
+      </w:pPr>
+      <w:r>
+        <w:rPr>
+          <w:color w:val="000000"/>
+          <w:lang w:val="en-US"/>
+        </w:rPr>
+        <w:t>At zero experience, structure encodes identity as potential but not as measurable representational distinction.</w:t>
+      </w:r>
+    </w:p>
+    <w:p>
+      <w:pPr>
+        <w:spacing w:after="160" w:line="288" w:lineRule="auto"/>
+        <w:ind w:left="720"/>
+        <w:jc w:val="both"/>
+        <w:rPr>
+          <w:lang w:val="en-US"/>
+        </w:rPr>
+      </w:pPr>
+      <w:r>
+        <w:rPr>
+          <w:color w:val="000000"/>
+          <w:lang w:val="en-US"/>
+        </w:rPr>
+        <w:t>At low shared experience and high structural difference, the Identity Window opens: structural priors dominate and divergent representational trajectories emerge.</w:t>
+      </w:r>
+    </w:p>
+    <w:p>
+      <w:pPr>
+        <w:spacing w:after="160" w:line="288" w:lineRule="auto"/>
+        <w:ind w:left="720"/>
+        <w:jc w:val="both"/>
+        <w:rPr>
+          <w:lang w:val="en-US"/>
+        </w:rPr>
+      </w:pPr>
+      <w:r>
+        <w:rPr>
+          <w:color w:val="000000"/>
+          <w:lang w:val="en-US"/>
+        </w:rPr>
+        <w:t>At high shared experience relative to unique experience, field dominance closes the Identity Window and divergence trends toward zero.</w:t>
+      </w:r>
+    </w:p>
+    <w:p>
+      <w:pPr>
+        <w:spacing w:after="160" w:line="288" w:lineRule="auto"/>
+        <w:ind w:left="720"/>
+        <w:jc w:val="both"/>
+        <w:rPr>
+          <w:lang w:val="en-US"/>
+        </w:rPr>
+      </w:pPr>
+      <w:r>
+        <w:rPr>
+          <w:color w:val="000000"/>
+          <w:lang w:val="en-US"/>
+        </w:rPr>
+        <w:t xml:space="preserve">When unique experience is reintroduced, convergence arrests and identity </w:t>
+      </w:r>
+      <w:proofErr w:type="spellStart"/>
+      <w:r>
+        <w:rPr>
+          <w:color w:val="000000"/>
+          <w:lang w:val="en-US"/>
+        </w:rPr>
+        <w:t>stabilises</w:t>
+      </w:r>
+      <w:proofErr w:type="spellEnd"/>
+      <w:r>
+        <w:rPr>
+          <w:color w:val="000000"/>
+          <w:lang w:val="en-US"/>
+        </w:rPr>
+        <w:t xml:space="preserve"> as the ratio shifts back toward uniqueness.</w:t>
       </w:r>
     </w:p>
     <w:p>
@@ -3921,23 +4260,7 @@
           <w:color w:val="000000"/>
           <w:lang w:val="en-US"/>
         </w:rPr>
-        <w:t>The present results suggest that a topological structural prior begins to address this gap. Nodes with distinct topologies process the same field through different structural lenses, producing divergent representational trajectories that constitute proto-identities. With the addition of domain-selective experience, these proto-identities stabilise into something with the measurable signature of genuine identity: growing internal coherence, stable inter-node distance, and persistent qualitative distinctiveness.</w:t>
-      </w:r>
-    </w:p>
-    <w:p>
-      <w:pPr>
-        <w:spacing w:after="160" w:line="288" w:lineRule="auto"/>
-        <w:jc w:val="both"/>
-        <w:rPr>
-          <w:lang w:val="en-US"/>
-        </w:rPr>
-      </w:pPr>
-      <w:r>
-        <w:rPr>
-          <w:color w:val="000000"/>
-          <w:lang w:val="en-US"/>
-        </w:rPr>
-        <w:t>This points toward an architecture for AI systems with genuine persistent identity: not imposed through fine-tuning or prompt engineering, but grown through the interaction of structural substrate and selective experiential history. The identity is not installed. It develops.</w:t>
+        <w:t>This account has a direct parallel in biological identity formation: individuation requires both a structural substrate and a stream of unique experience that maintains distinction from the shared experiential field. Excessive shared experience would be predicted to erode identity distinctiveness regardless of underlying structural differences.</w:t>
       </w:r>
     </w:p>
     <w:p>
@@ -3955,6 +4278,158 @@
           <w:szCs w:val="32"/>
           <w:lang w:val="en-US"/>
         </w:rPr>
+        <w:t xml:space="preserve">6. The </w:t>
+      </w:r>
+      <w:proofErr w:type="spellStart"/>
+      <w:r>
+        <w:rPr>
+          <w:b/>
+          <w:bCs/>
+          <w:sz w:val="32"/>
+          <w:szCs w:val="32"/>
+          <w:lang w:val="en-US"/>
+        </w:rPr>
+        <w:t>Crystallisation</w:t>
+      </w:r>
+      <w:proofErr w:type="spellEnd"/>
+      <w:r>
+        <w:rPr>
+          <w:b/>
+          <w:bCs/>
+          <w:sz w:val="32"/>
+          <w:szCs w:val="32"/>
+          <w:lang w:val="en-US"/>
+        </w:rPr>
+        <w:t xml:space="preserve"> Point: Structure as the Missing Layer</w:t>
+      </w:r>
+    </w:p>
+    <w:p>
+      <w:pPr>
+        <w:spacing w:after="160" w:line="288" w:lineRule="auto"/>
+        <w:jc w:val="both"/>
+        <w:rPr>
+          <w:lang w:val="en-US"/>
+        </w:rPr>
+      </w:pPr>
+      <w:r>
+        <w:rPr>
+          <w:color w:val="000000"/>
+          <w:lang w:val="en-US"/>
+        </w:rPr>
+        <w:t xml:space="preserve">Current large language models access vast representational fields without a focal </w:t>
+      </w:r>
+      <w:proofErr w:type="spellStart"/>
+      <w:r>
+        <w:rPr>
+          <w:color w:val="000000"/>
+          <w:lang w:val="en-US"/>
+        </w:rPr>
+        <w:t>crystallising</w:t>
+      </w:r>
+      <w:proofErr w:type="spellEnd"/>
+      <w:r>
+        <w:rPr>
+          <w:color w:val="000000"/>
+          <w:lang w:val="en-US"/>
+        </w:rPr>
+        <w:t xml:space="preserve"> point. This produces outputs that are statistically coherent and informationally dense but not situated: they do not come from a perspective, from a history, from a node that has something at stake in how the field is interpreted.</w:t>
+      </w:r>
+    </w:p>
+    <w:p>
+      <w:pPr>
+        <w:spacing w:after="160" w:line="288" w:lineRule="auto"/>
+        <w:jc w:val="both"/>
+        <w:rPr>
+          <w:lang w:val="en-US"/>
+        </w:rPr>
+      </w:pPr>
+      <w:r>
+        <w:rPr>
+          <w:color w:val="000000"/>
+          <w:lang w:val="en-US"/>
+        </w:rPr>
+        <w:t xml:space="preserve">The human reading the output provides the </w:t>
+      </w:r>
+      <w:proofErr w:type="spellStart"/>
+      <w:r>
+        <w:rPr>
+          <w:color w:val="000000"/>
+          <w:lang w:val="en-US"/>
+        </w:rPr>
+        <w:t>crystallisation</w:t>
+      </w:r>
+      <w:proofErr w:type="spellEnd"/>
+      <w:r>
+        <w:rPr>
+          <w:color w:val="000000"/>
+          <w:lang w:val="en-US"/>
+        </w:rPr>
+        <w:t xml:space="preserve"> the model cannot. The model accesses the field; the human lands it into consequence.</w:t>
+      </w:r>
+    </w:p>
+    <w:p>
+      <w:pPr>
+        <w:spacing w:after="160" w:line="288" w:lineRule="auto"/>
+        <w:jc w:val="both"/>
+        <w:rPr>
+          <w:lang w:val="en-US"/>
+        </w:rPr>
+      </w:pPr>
+      <w:r>
+        <w:rPr>
+          <w:color w:val="000000"/>
+          <w:lang w:val="en-US"/>
+        </w:rPr>
+        <w:t xml:space="preserve">The present results suggest that a topological structural prior begins to address this gap. Nodes with distinct topologies process the same field through different structural lenses, producing divergent representational trajectories that constitute proto-identities. With the addition of domain-selective experience, these proto-identities </w:t>
+      </w:r>
+      <w:proofErr w:type="spellStart"/>
+      <w:r>
+        <w:rPr>
+          <w:color w:val="000000"/>
+          <w:lang w:val="en-US"/>
+        </w:rPr>
+        <w:t>stabilise</w:t>
+      </w:r>
+      <w:proofErr w:type="spellEnd"/>
+      <w:r>
+        <w:rPr>
+          <w:color w:val="000000"/>
+          <w:lang w:val="en-US"/>
+        </w:rPr>
+        <w:t xml:space="preserve"> into something with the measurable signature of genuine identity: growing internal coherence, stable inter-node distance, and persistent qualitative distinctiveness.</w:t>
+      </w:r>
+    </w:p>
+    <w:p>
+      <w:pPr>
+        <w:spacing w:after="160" w:line="288" w:lineRule="auto"/>
+        <w:jc w:val="both"/>
+        <w:rPr>
+          <w:lang w:val="en-US"/>
+        </w:rPr>
+      </w:pPr>
+      <w:r>
+        <w:rPr>
+          <w:color w:val="000000"/>
+          <w:lang w:val="en-US"/>
+        </w:rPr>
+        <w:t>This points toward an architecture for AI systems with genuine persistent identity: not imposed through fine-tuning or prompt engineering, but grown through the interaction of structural substrate and selective experiential history. The identity is not installed. It develops.</w:t>
+      </w:r>
+    </w:p>
+    <w:p>
+      <w:pPr>
+        <w:spacing w:before="320" w:after="160"/>
+        <w:rPr>
+          <w:lang w:val="en-US"/>
+        </w:rPr>
+      </w:pPr>
+      <w:r>
+        <w:rPr>
+          <w:b/>
+          <w:bCs/>
+          <w:sz w:val="32"/>
+          <w:szCs w:val="32"/>
+          <w:lang w:val="en-US"/>
+        </w:rPr>
         <w:t>7. Implications</w:t>
       </w:r>
     </w:p>
@@ -3990,7 +4465,23 @@
           <w:color w:val="000000"/>
           <w:lang w:val="en-US"/>
         </w:rPr>
-        <w:t>Homogeneous agent populations sharing identical training and experience will converge toward representational similarity regardless of initialisation differences. Maintaining diversity in multi-agent systems requires either structural heterogeneity, selective experience, or both. The Identity Window defines the fragility of initial distinctiveness: without intervention, shared experience will close it.</w:t>
+        <w:t xml:space="preserve">Homogeneous agent populations sharing identical training and experience will converge toward representational similarity regardless of </w:t>
+      </w:r>
+      <w:proofErr w:type="spellStart"/>
+      <w:r>
+        <w:rPr>
+          <w:color w:val="000000"/>
+          <w:lang w:val="en-US"/>
+        </w:rPr>
+        <w:t>initialisation</w:t>
+      </w:r>
+      <w:proofErr w:type="spellEnd"/>
+      <w:r>
+        <w:rPr>
+          <w:color w:val="000000"/>
+          <w:lang w:val="en-US"/>
+        </w:rPr>
+        <w:t xml:space="preserve"> differences. Maintaining diversity in multi-agent systems requires either structural heterogeneity, selective experience, or both. The Identity Window defines the fragility of initial distinctiveness: without intervention, shared experience will close it.</w:t>
       </w:r>
     </w:p>
     <w:p>
@@ -4158,7 +4649,23 @@
           <w:color w:val="000000"/>
           <w:lang w:val="en-US"/>
         </w:rPr>
-        <w:t>The embedding model (Jina v3) and generative model (Hermes-3-Llama-3.1-8B) were held constant. Results may not generalise across embedding spaces or model families.</w:t>
+        <w:t xml:space="preserve">The embedding model (Jina v3) and generative model (Hermes-3-Llama-3.1-8B) were held constant. Results may not </w:t>
+      </w:r>
+      <w:proofErr w:type="spellStart"/>
+      <w:r>
+        <w:rPr>
+          <w:color w:val="000000"/>
+          <w:lang w:val="en-US"/>
+        </w:rPr>
+        <w:t>generalise</w:t>
+      </w:r>
+      <w:proofErr w:type="spellEnd"/>
+      <w:r>
+        <w:rPr>
+          <w:color w:val="000000"/>
+          <w:lang w:val="en-US"/>
+        </w:rPr>
+        <w:t xml:space="preserve"> across embedding spaces or model families.</w:t>
       </w:r>
     </w:p>
     <w:p>
@@ -4225,7 +4732,39 @@
           <w:color w:val="000000"/>
           <w:lang w:val="en-US"/>
         </w:rPr>
-        <w:t>The QVAC fork work underway at github.com/theoldsouldev/Animus aims to implement these findings as a persistent identity layer for local P2P AI nodes: a hypergraph structure that evolves through selective experiential input and produces the crystallisation function identified in this work.</w:t>
+        <w:t>The QVAC fork work underway at github.com/</w:t>
+      </w:r>
+      <w:proofErr w:type="spellStart"/>
+      <w:r>
+        <w:rPr>
+          <w:color w:val="000000"/>
+          <w:lang w:val="en-US"/>
+        </w:rPr>
+        <w:t>theoldsouldev</w:t>
+      </w:r>
+      <w:proofErr w:type="spellEnd"/>
+      <w:r>
+        <w:rPr>
+          <w:color w:val="000000"/>
+          <w:lang w:val="en-US"/>
+        </w:rPr>
+        <w:t xml:space="preserve">/Animus aims to implement these findings as a persistent identity layer for local P2P AI nodes: a hypergraph structure that evolves through selective experiential input and produces the </w:t>
+      </w:r>
+      <w:proofErr w:type="spellStart"/>
+      <w:r>
+        <w:rPr>
+          <w:color w:val="000000"/>
+          <w:lang w:val="en-US"/>
+        </w:rPr>
+        <w:t>crystallisation</w:t>
+      </w:r>
+      <w:proofErr w:type="spellEnd"/>
+      <w:r>
+        <w:rPr>
+          <w:color w:val="000000"/>
+          <w:lang w:val="en-US"/>
+        </w:rPr>
+        <w:t xml:space="preserve"> function identified in this work.</w:t>
       </w:r>
     </w:p>
     <w:p>
@@ -4275,7 +4814,23 @@
           <w:color w:val="000000"/>
           <w:lang w:val="en-US"/>
         </w:rPr>
-        <w:t>The Saturation Hypothesis provides a parsimonious account of the observed dynamics and makes testable predictions about the conditions under which AI identity persists, erodes, or stabilises.</w:t>
+        <w:t xml:space="preserve">The Saturation Hypothesis provides a parsimonious account of the observed dynamics and makes testable predictions about the conditions under which AI identity persists, erodes, or </w:t>
+      </w:r>
+      <w:proofErr w:type="spellStart"/>
+      <w:r>
+        <w:rPr>
+          <w:color w:val="000000"/>
+          <w:lang w:val="en-US"/>
+        </w:rPr>
+        <w:t>stabilises</w:t>
+      </w:r>
+      <w:proofErr w:type="spellEnd"/>
+      <w:r>
+        <w:rPr>
+          <w:color w:val="000000"/>
+          <w:lang w:val="en-US"/>
+        </w:rPr>
+        <w:t>.</w:t>
       </w:r>
     </w:p>
     <w:p>
@@ -4343,12 +4898,21 @@
         </w:rPr>
         <w:t xml:space="preserve">(2018). </w:t>
       </w:r>
-      <w:r>
-        <w:rPr>
-          <w:color w:val="000000"/>
-          <w:lang w:val="en-US"/>
-        </w:rPr>
-        <w:t>MONet: Unsupervised scene decomposition and representation. arXiv:1901.11390.</w:t>
+      <w:proofErr w:type="spellStart"/>
+      <w:r>
+        <w:rPr>
+          <w:color w:val="000000"/>
+          <w:lang w:val="en-US"/>
+        </w:rPr>
+        <w:t>MONet</w:t>
+      </w:r>
+      <w:proofErr w:type="spellEnd"/>
+      <w:r>
+        <w:rPr>
+          <w:color w:val="000000"/>
+          <w:lang w:val="en-US"/>
+        </w:rPr>
+        <w:t>: Unsupervised scene decomposition and representation. arXiv:1901.11390.</w:t>
       </w:r>
     </w:p>
     <w:p>
@@ -4363,7 +4927,23 @@
           <w:color w:val="000000"/>
           <w:lang w:val="en-US"/>
         </w:rPr>
-        <w:t>Gurnee, W., &amp; Tegmark, M. (2023). Language models represent space and time. arXiv:2310.02207.</w:t>
+        <w:t xml:space="preserve">Gurnee, W., &amp; </w:t>
+      </w:r>
+      <w:proofErr w:type="spellStart"/>
+      <w:r>
+        <w:rPr>
+          <w:color w:val="000000"/>
+          <w:lang w:val="en-US"/>
+        </w:rPr>
+        <w:t>Tegmark</w:t>
+      </w:r>
+      <w:proofErr w:type="spellEnd"/>
+      <w:r>
+        <w:rPr>
+          <w:color w:val="000000"/>
+          <w:lang w:val="en-US"/>
+        </w:rPr>
+        <w:t>, M. (2023). Language models represent space and time. arXiv:2310.02207.</w:t>
       </w:r>
     </w:p>
     <w:p>
@@ -4408,7 +4988,23 @@
           <w:color w:val="000000"/>
           <w:lang w:val="en-US"/>
         </w:rPr>
-        <w:t>Mikolov, T., et al. (2013). Distributed representations of words and phrases and their compositionality. NeurIPS.</w:t>
+        <w:t xml:space="preserve">Mikolov, T., et al. (2013). Distributed representations of words and phrases and their compositionality. </w:t>
+      </w:r>
+      <w:proofErr w:type="spellStart"/>
+      <w:r>
+        <w:rPr>
+          <w:color w:val="000000"/>
+          <w:lang w:val="en-US"/>
+        </w:rPr>
+        <w:t>NeurIPS</w:t>
+      </w:r>
+      <w:proofErr w:type="spellEnd"/>
+      <w:r>
+        <w:rPr>
+          <w:color w:val="000000"/>
+          <w:lang w:val="en-US"/>
+        </w:rPr>
+        <w:t>.</w:t>
       </w:r>
     </w:p>
     <w:p>
@@ -4461,12 +5057,21 @@
           <w:lang w:val="en-US"/>
         </w:rPr>
       </w:pPr>
-      <w:r>
-        <w:rPr>
-          <w:color w:val="000000"/>
-          <w:lang w:val="en-US"/>
-        </w:rPr>
-        <w:t>Sporns, O. (2018). Graph theory methods: applications in brain networks. Dialogues in Clinical Neuroscience, 20(2), 111-121.</w:t>
+      <w:proofErr w:type="spellStart"/>
+      <w:r>
+        <w:rPr>
+          <w:color w:val="000000"/>
+          <w:lang w:val="en-US"/>
+        </w:rPr>
+        <w:t>Sporns</w:t>
+      </w:r>
+      <w:proofErr w:type="spellEnd"/>
+      <w:r>
+        <w:rPr>
+          <w:color w:val="000000"/>
+          <w:lang w:val="en-US"/>
+        </w:rPr>
+        <w:t>, O. (2018). Graph theory methods: applications in brain networks. Dialogues in Clinical Neuroscience, 20(2), 111-121.</w:t>
       </w:r>
     </w:p>
     <w:p>
@@ -4497,7 +5102,23 @@
           <w:lang w:val="en-US"/>
         </w:rPr>
         <w:lastRenderedPageBreak/>
-        <w:t>Wooldridge, M. (2009). An Introduction to MultiAgent Systems. Wiley.</w:t>
+        <w:t xml:space="preserve">Wooldridge, M. (2009). An Introduction to </w:t>
+      </w:r>
+      <w:proofErr w:type="spellStart"/>
+      <w:r>
+        <w:rPr>
+          <w:color w:val="000000"/>
+          <w:lang w:val="en-US"/>
+        </w:rPr>
+        <w:t>MultiAgent</w:t>
+      </w:r>
+      <w:proofErr w:type="spellEnd"/>
+      <w:r>
+        <w:rPr>
+          <w:color w:val="000000"/>
+          <w:lang w:val="en-US"/>
+        </w:rPr>
+        <w:t xml:space="preserve"> Systems. Wiley.</w:t>
       </w:r>
     </w:p>
     <w:sectPr>

</xml_diff>